<commit_message>
airgap-vcf911: 補「沒有 govc 怎麼做」工具對照(govc / PowerCLI / UI / REST)
- README 新增對照表 + 連線方式 + REST 實例(本 lab 實測 payload 格式)
- docx 新增第十三章,25 頁
- 客戶現場沒有 govc 時:CL 與 OVF 匯入走 PowerCLI,Supervisor/Namespace/映像庫指派走 UI 或 REST

Co-Authored-By: Claude Opus 5 <noreply@anthropic.com>
</commit_message>
<xml_diff>
--- a/airgap-vcf911/VCF911-VKS-AirGap-StepByStep.docx
+++ b/airgap-vcf911/VCF911-VKS-AirGap-StepByStep.docx
@@ -254,6 +254,18 @@
           <w:szCs w:val="21"/>
         </w:rPr>
         <w:t xml:space="preserve">十二、踩坑與排錯</w:t>
+      </w:r>
+    </w:p>
+    <w:p>
+      <w:pPr>
+        <w:spacing w:after="60"/>
+      </w:pPr>
+      <w:r>
+        <w:rPr>
+          <w:sz w:val="21"/>
+          <w:szCs w:val="21"/>
+        </w:rPr>
+        <w:t xml:space="preserve">十三、沒有 govc 怎麼做(工具對照)</w:t>
       </w:r>
     </w:p>
     <w:p>
@@ -5138,6 +5150,1139 @@
         </w:tc>
       </w:tr>
     </w:tbl>
+    <w:p>
+      <w:r>
+        <w:br w:type="page"/>
+      </w:r>
+    </w:p>
+    <w:p>
+      <w:pPr>
+        <w:pStyle w:val="Heading1"/>
+        <w:spacing w:after="160" w:before="340"/>
+      </w:pPr>
+      <w:r>
+        <w:t xml:space="preserve">十三、沒有 govc 怎麼做(工具對照)</w:t>
+      </w:r>
+    </w:p>
+    <w:p>
+      <w:pPr>
+        <w:spacing w:after="110"/>
+      </w:pPr>
+      <w:r>
+        <w:rPr>
+          <w:sz w:val="21"/>
+          <w:szCs w:val="21"/>
+        </w:rPr>
+        <w:t xml:space="preserve">本手冊指令以 govc 示範,但客戶現場常常沒有這支工具。以下是等價做法 —— PowerCLI 與 vSphere Client UI 不需要額外安裝任何東西。</w:t>
+      </w:r>
+    </w:p>
+    <w:p>
+      <w:pPr>
+        <w:pStyle w:val="Heading2"/>
+        <w:spacing w:after="120" w:before="260"/>
+      </w:pPr>
+      <w:r>
+        <w:t xml:space="preserve">13.1 連線方式</w:t>
+      </w:r>
+    </w:p>
+    <w:p>
+      <w:pPr>
+        <w:shd w:fill="F4F4F4" w:val="clear"/>
+        <w:spacing w:after="70" w:before="70"/>
+        <w:ind w:left="220"/>
+      </w:pPr>
+      <w:r>
+        <w:rPr>
+          <w:rFonts w:ascii="Consolas" w:cs="Consolas" w:eastAsia="Consolas" w:hAnsi="Consolas"/>
+          <w:sz w:val="16"/>
+          <w:szCs w:val="16"/>
+        </w:rPr>
+        <w:t xml:space="preserve"># PowerCLI</w:t>
+      </w:r>
+      <w:r>
+        <w:rPr>
+          <w:rFonts w:ascii="Consolas" w:cs="Consolas" w:eastAsia="Consolas" w:hAnsi="Consolas"/>
+          <w:sz w:val="16"/>
+          <w:szCs w:val="16"/>
+        </w:rPr>
+        <w:br/>
+        <w:t xml:space="preserve">Connect-VIServer &lt;vc&gt; -User administrator@vsphere.local -Password '&lt;pw&gt;'</w:t>
+      </w:r>
+      <w:r>
+        <w:rPr>
+          <w:rFonts w:ascii="Consolas" w:cs="Consolas" w:eastAsia="Consolas" w:hAnsi="Consolas"/>
+          <w:sz w:val="16"/>
+          <w:szCs w:val="16"/>
+        </w:rPr>
+        <w:br/>
+        <w:t xml:space="preserve"/>
+      </w:r>
+      <w:r>
+        <w:rPr>
+          <w:rFonts w:ascii="Consolas" w:cs="Consolas" w:eastAsia="Consolas" w:hAnsi="Consolas"/>
+          <w:sz w:val="16"/>
+          <w:szCs w:val="16"/>
+        </w:rPr>
+        <w:br/>
+        <w:t xml:space="preserve"># REST(vSphere Automation API)</w:t>
+      </w:r>
+      <w:r>
+        <w:rPr>
+          <w:rFonts w:ascii="Consolas" w:cs="Consolas" w:eastAsia="Consolas" w:hAnsi="Consolas"/>
+          <w:sz w:val="16"/>
+          <w:szCs w:val="16"/>
+        </w:rPr>
+        <w:br/>
+        <w:t xml:space="preserve">S=$(curl -sk -X POST -u 'administrator@vsphere.local:&lt;pw&gt;' https://&lt;vc&gt;/api/session | tr -d '"')</w:t>
+      </w:r>
+      <w:r>
+        <w:rPr>
+          <w:rFonts w:ascii="Consolas" w:cs="Consolas" w:eastAsia="Consolas" w:hAnsi="Consolas"/>
+          <w:sz w:val="16"/>
+          <w:szCs w:val="16"/>
+        </w:rPr>
+        <w:br/>
+        <w:t xml:space="preserve">H="vmware-api-session-id: $S"</w:t>
+      </w:r>
+      <w:r>
+        <w:rPr>
+          <w:rFonts w:ascii="Consolas" w:cs="Consolas" w:eastAsia="Consolas" w:hAnsi="Consolas"/>
+          <w:sz w:val="16"/>
+          <w:szCs w:val="16"/>
+        </w:rPr>
+        <w:br/>
+        <w:t xml:space="preserve"/>
+      </w:r>
+      <w:r>
+        <w:rPr>
+          <w:rFonts w:ascii="Consolas" w:cs="Consolas" w:eastAsia="Consolas" w:hAnsi="Consolas"/>
+          <w:sz w:val="16"/>
+          <w:szCs w:val="16"/>
+        </w:rPr>
+        <w:br/>
+        <w:t xml:space="preserve"># govc(單檔 exe)</w:t>
+      </w:r>
+      <w:r>
+        <w:rPr>
+          <w:rFonts w:ascii="Consolas" w:cs="Consolas" w:eastAsia="Consolas" w:hAnsi="Consolas"/>
+          <w:sz w:val="16"/>
+          <w:szCs w:val="16"/>
+        </w:rPr>
+        <w:br/>
+        <w:t xml:space="preserve">export GOVC_URL='https://&lt;vc&gt;' GOVC_USERNAME='administrator@vsphere.local' GOVC_PASSWORD='&lt;pw&gt;' GOVC_INSECURE=1</w:t>
+      </w:r>
+      <w:r>
+        <w:rPr>
+          <w:rFonts w:ascii="Consolas" w:cs="Consolas" w:eastAsia="Consolas" w:hAnsi="Consolas"/>
+          <w:sz w:val="16"/>
+          <w:szCs w:val="16"/>
+        </w:rPr>
+        <w:br/>
+        <w:t xml:space="preserve">export MSYS_NO_PATHCONV=1      # Git-Bash 必加,否則 inventory 路徑會被轉成 C:\...</w:t>
+      </w:r>
+    </w:p>
+    <w:p>
+      <w:pPr>
+        <w:pStyle w:val="Heading2"/>
+        <w:spacing w:after="120" w:before="260"/>
+      </w:pPr>
+      <w:r>
+        <w:t xml:space="preserve">13.2 對照表</w:t>
+      </w:r>
+    </w:p>
+    <w:tbl>
+      <w:tblPr>
+        <w:tblW w:type="dxa" w:w="9000"/>
+        <w:tblBorders>
+          <w:top w:val="single" w:color="auto" w:sz="4"/>
+          <w:left w:val="single" w:color="auto" w:sz="4"/>
+          <w:bottom w:val="single" w:color="auto" w:sz="4"/>
+          <w:right w:val="single" w:color="auto" w:sz="4"/>
+          <w:insideH w:val="single" w:color="auto" w:sz="4"/>
+          <w:insideV w:val="single" w:color="auto" w:sz="4"/>
+        </w:tblBorders>
+      </w:tblPr>
+      <w:tblGrid>
+        <w:gridCol w:w="1350"/>
+        <w:gridCol w:w="2250"/>
+        <w:gridCol w:w="2340"/>
+        <w:gridCol w:w="3060"/>
+      </w:tblGrid>
+      <w:tr>
+        <w:trPr>
+          <w:tblHeader/>
+        </w:trPr>
+        <w:tc>
+          <w:tcPr>
+            <w:tcW w:type="dxa" w:w="1350"/>
+            <w:shd w:fill="1F4E79" w:val="clear"/>
+          </w:tcPr>
+          <w:p>
+            <w:r>
+              <w:rPr>
+                <w:b/>
+                <w:bCs/>
+                <w:color w:val="FFFFFF"/>
+                <w:sz w:val="19"/>
+                <w:szCs w:val="19"/>
+              </w:rPr>
+              <w:t xml:space="preserve">動作</w:t>
+            </w:r>
+          </w:p>
+        </w:tc>
+        <w:tc>
+          <w:tcPr>
+            <w:tcW w:type="dxa" w:w="2250"/>
+            <w:shd w:fill="1F4E79" w:val="clear"/>
+          </w:tcPr>
+          <w:p>
+            <w:r>
+              <w:rPr>
+                <w:b/>
+                <w:bCs/>
+                <w:color w:val="FFFFFF"/>
+                <w:sz w:val="19"/>
+                <w:szCs w:val="19"/>
+              </w:rPr>
+              <w:t xml:space="preserve">govc</w:t>
+            </w:r>
+          </w:p>
+        </w:tc>
+        <w:tc>
+          <w:tcPr>
+            <w:tcW w:type="dxa" w:w="2340"/>
+            <w:shd w:fill="1F4E79" w:val="clear"/>
+          </w:tcPr>
+          <w:p>
+            <w:r>
+              <w:rPr>
+                <w:b/>
+                <w:bCs/>
+                <w:color w:val="FFFFFF"/>
+                <w:sz w:val="19"/>
+                <w:szCs w:val="19"/>
+              </w:rPr>
+              <w:t xml:space="preserve">PowerCLI</w:t>
+            </w:r>
+          </w:p>
+        </w:tc>
+        <w:tc>
+          <w:tcPr>
+            <w:tcW w:type="dxa" w:w="3060"/>
+            <w:shd w:fill="1F4E79" w:val="clear"/>
+          </w:tcPr>
+          <w:p>
+            <w:r>
+              <w:rPr>
+                <w:b/>
+                <w:bCs/>
+                <w:color w:val="FFFFFF"/>
+                <w:sz w:val="19"/>
+                <w:szCs w:val="19"/>
+              </w:rPr>
+              <w:t xml:space="preserve">UI / REST</w:t>
+            </w:r>
+          </w:p>
+        </w:tc>
+      </w:tr>
+      <w:tr>
+        <w:tc>
+          <w:tcPr>
+            <w:tcW w:type="dxa" w:w="1350"/>
+          </w:tcPr>
+          <w:p>
+            <w:r>
+              <w:rPr>
+                <w:sz w:val="18"/>
+                <w:szCs w:val="18"/>
+              </w:rPr>
+              <w:t xml:space="preserve">建訂閱式 Content Library</w:t>
+            </w:r>
+          </w:p>
+        </w:tc>
+        <w:tc>
+          <w:tcPr>
+            <w:tcW w:type="dxa" w:w="2250"/>
+          </w:tcPr>
+          <w:p>
+            <w:r>
+              <w:rPr>
+                <w:sz w:val="18"/>
+                <w:szCs w:val="18"/>
+              </w:rPr>
+              <w:t xml:space="preserve">library.create -sub &lt;lib.json&gt; -sub-autosync=true -ds &lt;ds&gt; &lt;name&gt;</w:t>
+            </w:r>
+          </w:p>
+        </w:tc>
+        <w:tc>
+          <w:tcPr>
+            <w:tcW w:type="dxa" w:w="2340"/>
+          </w:tcPr>
+          <w:p>
+            <w:r>
+              <w:rPr>
+                <w:sz w:val="18"/>
+                <w:szCs w:val="18"/>
+              </w:rPr>
+              <w:t xml:space="preserve">New-ContentLibrary -Name &lt;n&gt; -Datastore &lt;ds&gt; -SubscriptionUrl &lt;url&gt; -AutomaticSync</w:t>
+            </w:r>
+          </w:p>
+        </w:tc>
+        <w:tc>
+          <w:tcPr>
+            <w:tcW w:type="dxa" w:w="3060"/>
+          </w:tcPr>
+          <w:p>
+            <w:r>
+              <w:rPr>
+                <w:sz w:val="18"/>
+                <w:szCs w:val="18"/>
+              </w:rPr>
+              <w:t xml:space="preserve">UI:Content Libraries → CREATE → Subscribed;REST:POST /api/content/subscribed-library</w:t>
+            </w:r>
+          </w:p>
+        </w:tc>
+      </w:tr>
+      <w:tr>
+        <w:tc>
+          <w:tcPr>
+            <w:tcW w:type="dxa" w:w="1350"/>
+            <w:shd w:fill="F7F9FC" w:val="clear"/>
+          </w:tcPr>
+          <w:p>
+            <w:r>
+              <w:rPr>
+                <w:sz w:val="18"/>
+                <w:szCs w:val="18"/>
+              </w:rPr>
+              <w:t xml:space="preserve">建本機 Content Library</w:t>
+            </w:r>
+          </w:p>
+        </w:tc>
+        <w:tc>
+          <w:tcPr>
+            <w:tcW w:type="dxa" w:w="2250"/>
+            <w:shd w:fill="F7F9FC" w:val="clear"/>
+          </w:tcPr>
+          <w:p>
+            <w:r>
+              <w:rPr>
+                <w:sz w:val="18"/>
+                <w:szCs w:val="18"/>
+              </w:rPr>
+              <w:t xml:space="preserve">library.create -ds &lt;ds&gt; &lt;name&gt;</w:t>
+            </w:r>
+          </w:p>
+        </w:tc>
+        <w:tc>
+          <w:tcPr>
+            <w:tcW w:type="dxa" w:w="2340"/>
+            <w:shd w:fill="F7F9FC" w:val="clear"/>
+          </w:tcPr>
+          <w:p>
+            <w:r>
+              <w:rPr>
+                <w:sz w:val="18"/>
+                <w:szCs w:val="18"/>
+              </w:rPr>
+              <w:t xml:space="preserve">New-ContentLibrary -Name &lt;n&gt; -Datastore &lt;ds&gt;</w:t>
+            </w:r>
+          </w:p>
+        </w:tc>
+        <w:tc>
+          <w:tcPr>
+            <w:tcW w:type="dxa" w:w="3060"/>
+            <w:shd w:fill="F7F9FC" w:val="clear"/>
+          </w:tcPr>
+          <w:p>
+            <w:r>
+              <w:rPr>
+                <w:sz w:val="18"/>
+                <w:szCs w:val="18"/>
+              </w:rPr>
+              <w:t xml:space="preserve">UI:CREATE → Local;REST:POST /api/content/local-library</w:t>
+            </w:r>
+          </w:p>
+        </w:tc>
+      </w:tr>
+      <w:tr>
+        <w:tc>
+          <w:tcPr>
+            <w:tcW w:type="dxa" w:w="1350"/>
+          </w:tcPr>
+          <w:p>
+            <w:r>
+              <w:rPr>
+                <w:sz w:val="18"/>
+                <w:szCs w:val="18"/>
+              </w:rPr>
+              <w:t xml:space="preserve">匯入 OVF</w:t>
+            </w:r>
+          </w:p>
+        </w:tc>
+        <w:tc>
+          <w:tcPr>
+            <w:tcW w:type="dxa" w:w="2250"/>
+          </w:tcPr>
+          <w:p>
+            <w:r>
+              <w:rPr>
+                <w:sz w:val="18"/>
+                <w:szCs w:val="18"/>
+              </w:rPr>
+              <w:t xml:space="preserve">library.import -n &lt;item&gt; &lt;lib&gt; 'E:\path\x.ovf'</w:t>
+            </w:r>
+          </w:p>
+        </w:tc>
+        <w:tc>
+          <w:tcPr>
+            <w:tcW w:type="dxa" w:w="2340"/>
+          </w:tcPr>
+          <w:p>
+            <w:r>
+              <w:rPr>
+                <w:sz w:val="18"/>
+                <w:szCs w:val="18"/>
+              </w:rPr>
+              <w:t xml:space="preserve">New-ContentLibraryItem -ContentLibrary &lt;lib&gt; -Name &lt;item&gt; -ItemType ovf -Files 'E:\path\x.ovf'</w:t>
+            </w:r>
+          </w:p>
+        </w:tc>
+        <w:tc>
+          <w:tcPr>
+            <w:tcW w:type="dxa" w:w="3060"/>
+          </w:tcPr>
+          <w:p>
+            <w:r>
+              <w:rPr>
+                <w:sz w:val="18"/>
+                <w:szCs w:val="18"/>
+              </w:rPr>
+              <w:t xml:space="preserve">UI:CL → ACTIONS → Import Item(.ovf/.vmdk/.mf/.cert 要一起選);REST 需四步</w:t>
+            </w:r>
+          </w:p>
+        </w:tc>
+      </w:tr>
+      <w:tr>
+        <w:tc>
+          <w:tcPr>
+            <w:tcW w:type="dxa" w:w="1350"/>
+            <w:shd w:fill="F7F9FC" w:val="clear"/>
+          </w:tcPr>
+          <w:p>
+            <w:r>
+              <w:rPr>
+                <w:sz w:val="18"/>
+                <w:szCs w:val="18"/>
+              </w:rPr>
+              <w:t xml:space="preserve">列 CL / item</w:t>
+            </w:r>
+          </w:p>
+        </w:tc>
+        <w:tc>
+          <w:tcPr>
+            <w:tcW w:type="dxa" w:w="2250"/>
+            <w:shd w:fill="F7F9FC" w:val="clear"/>
+          </w:tcPr>
+          <w:p>
+            <w:r>
+              <w:rPr>
+                <w:sz w:val="18"/>
+                <w:szCs w:val="18"/>
+              </w:rPr>
+              <w:t xml:space="preserve">library.ls;library.ls '/&lt;lib&gt;/*'</w:t>
+            </w:r>
+          </w:p>
+        </w:tc>
+        <w:tc>
+          <w:tcPr>
+            <w:tcW w:type="dxa" w:w="2340"/>
+            <w:shd w:fill="F7F9FC" w:val="clear"/>
+          </w:tcPr>
+          <w:p>
+            <w:r>
+              <w:rPr>
+                <w:sz w:val="18"/>
+                <w:szCs w:val="18"/>
+              </w:rPr>
+              <w:t xml:space="preserve">Get-ContentLibrary / Get-ContentLibraryItem</w:t>
+            </w:r>
+          </w:p>
+        </w:tc>
+        <w:tc>
+          <w:tcPr>
+            <w:tcW w:type="dxa" w:w="3060"/>
+            <w:shd w:fill="F7F9FC" w:val="clear"/>
+          </w:tcPr>
+          <w:p>
+            <w:r>
+              <w:rPr>
+                <w:sz w:val="18"/>
+                <w:szCs w:val="18"/>
+              </w:rPr>
+              <w:t xml:space="preserve">REST:GET /api/content/local-library、GET /api/content/library/item?library_id=</w:t>
+            </w:r>
+          </w:p>
+        </w:tc>
+      </w:tr>
+      <w:tr>
+        <w:tc>
+          <w:tcPr>
+            <w:tcW w:type="dxa" w:w="1350"/>
+          </w:tcPr>
+          <w:p>
+            <w:r>
+              <w:rPr>
+                <w:sz w:val="18"/>
+                <w:szCs w:val="18"/>
+              </w:rPr>
+              <w:t xml:space="preserve">指派 K8s 映像庫</w:t>
+            </w:r>
+          </w:p>
+        </w:tc>
+        <w:tc>
+          <w:tcPr>
+            <w:tcW w:type="dxa" w:w="2250"/>
+          </w:tcPr>
+          <w:p>
+            <w:r>
+              <w:rPr>
+                <w:sz w:val="18"/>
+                <w:szCs w:val="18"/>
+              </w:rPr>
+              <w:t xml:space="preserve">無對應</w:t>
+            </w:r>
+          </w:p>
+        </w:tc>
+        <w:tc>
+          <w:tcPr>
+            <w:tcW w:type="dxa" w:w="2340"/>
+          </w:tcPr>
+          <w:p>
+            <w:r>
+              <w:rPr>
+                <w:sz w:val="18"/>
+                <w:szCs w:val="18"/>
+              </w:rPr>
+              <w:t xml:space="preserve">無對應</w:t>
+            </w:r>
+          </w:p>
+        </w:tc>
+        <w:tc>
+          <w:tcPr>
+            <w:tcW w:type="dxa" w:w="3060"/>
+          </w:tcPr>
+          <w:p>
+            <w:r>
+              <w:rPr>
+                <w:sz w:val="18"/>
+                <w:szCs w:val="18"/>
+              </w:rPr>
+              <w:t xml:space="preserve">UI:Supervisor → Configure → Kubernetes Services → Content Library → EDIT;REST:PATCH namespace-management/clusters/{c}</w:t>
+            </w:r>
+          </w:p>
+        </w:tc>
+      </w:tr>
+      <w:tr>
+        <w:tc>
+          <w:tcPr>
+            <w:tcW w:type="dxa" w:w="1350"/>
+            <w:shd w:fill="F7F9FC" w:val="clear"/>
+          </w:tcPr>
+          <w:p>
+            <w:r>
+              <w:rPr>
+                <w:sz w:val="18"/>
+                <w:szCs w:val="18"/>
+              </w:rPr>
+              <w:t xml:space="preserve">建 workload port group</w:t>
+            </w:r>
+          </w:p>
+        </w:tc>
+        <w:tc>
+          <w:tcPr>
+            <w:tcW w:type="dxa" w:w="2250"/>
+            <w:shd w:fill="F7F9FC" w:val="clear"/>
+          </w:tcPr>
+          <w:p>
+            <w:r>
+              <w:rPr>
+                <w:sz w:val="18"/>
+                <w:szCs w:val="18"/>
+              </w:rPr>
+              <w:t xml:space="preserve">dvs.portgroup.add -dvs &lt;vds&gt; -type earlyBinding -vlan 5 &lt;name&gt;</w:t>
+            </w:r>
+          </w:p>
+        </w:tc>
+        <w:tc>
+          <w:tcPr>
+            <w:tcW w:type="dxa" w:w="2340"/>
+            <w:shd w:fill="F7F9FC" w:val="clear"/>
+          </w:tcPr>
+          <w:p>
+            <w:r>
+              <w:rPr>
+                <w:sz w:val="18"/>
+                <w:szCs w:val="18"/>
+              </w:rPr>
+              <w:t xml:space="preserve">New-VDPortgroup -VDSwitch &lt;vds&gt; -Name &lt;n&gt; -VlanId 5</w:t>
+            </w:r>
+          </w:p>
+        </w:tc>
+        <w:tc>
+          <w:tcPr>
+            <w:tcW w:type="dxa" w:w="3060"/>
+            <w:shd w:fill="F7F9FC" w:val="clear"/>
+          </w:tcPr>
+          <w:p>
+            <w:r>
+              <w:rPr>
+                <w:sz w:val="18"/>
+                <w:szCs w:val="18"/>
+              </w:rPr>
+              <w:t xml:space="preserve">UI:Networking → VDS → ACTIONS → Distributed Port Group → New</w:t>
+            </w:r>
+          </w:p>
+        </w:tc>
+      </w:tr>
+      <w:tr>
+        <w:tc>
+          <w:tcPr>
+            <w:tcW w:type="dxa" w:w="1350"/>
+          </w:tcPr>
+          <w:p>
+            <w:r>
+              <w:rPr>
+                <w:sz w:val="18"/>
+                <w:szCs w:val="18"/>
+              </w:rPr>
+              <w:t xml:space="preserve">promiscuous / forged / MAC</w:t>
+            </w:r>
+          </w:p>
+        </w:tc>
+        <w:tc>
+          <w:tcPr>
+            <w:tcW w:type="dxa" w:w="2250"/>
+          </w:tcPr>
+          <w:p>
+            <w:r>
+              <w:rPr>
+                <w:sz w:val="18"/>
+                <w:szCs w:val="18"/>
+              </w:rPr>
+              <w:t xml:space="preserve">繁瑣</w:t>
+            </w:r>
+          </w:p>
+        </w:tc>
+        <w:tc>
+          <w:tcPr>
+            <w:tcW w:type="dxa" w:w="2340"/>
+          </w:tcPr>
+          <w:p>
+            <w:r>
+              <w:rPr>
+                <w:sz w:val="18"/>
+                <w:szCs w:val="18"/>
+              </w:rPr>
+              <w:t xml:space="preserve">ReconfigureDVPortgroup_Task + DVSSecurityPolicy</w:t>
+            </w:r>
+          </w:p>
+        </w:tc>
+        <w:tc>
+          <w:tcPr>
+            <w:tcW w:type="dxa" w:w="3060"/>
+          </w:tcPr>
+          <w:p>
+            <w:r>
+              <w:rPr>
+                <w:sz w:val="18"/>
+                <w:szCs w:val="18"/>
+              </w:rPr>
+              <w:t xml:space="preserve">UI:dvPortgroup → Edit → Security(三項 Accept)</w:t>
+            </w:r>
+          </w:p>
+        </w:tc>
+      </w:tr>
+      <w:tr>
+        <w:tc>
+          <w:tcPr>
+            <w:tcW w:type="dxa" w:w="1350"/>
+            <w:shd w:fill="F7F9FC" w:val="clear"/>
+          </w:tcPr>
+          <w:p>
+            <w:r>
+              <w:rPr>
+                <w:sz w:val="18"/>
+                <w:szCs w:val="18"/>
+              </w:rPr>
+              <w:t xml:space="preserve">主機 esxcli</w:t>
+            </w:r>
+          </w:p>
+        </w:tc>
+        <w:tc>
+          <w:tcPr>
+            <w:tcW w:type="dxa" w:w="2250"/>
+            <w:shd w:fill="F7F9FC" w:val="clear"/>
+          </w:tcPr>
+          <w:p>
+            <w:r>
+              <w:rPr>
+                <w:sz w:val="18"/>
+                <w:szCs w:val="18"/>
+              </w:rPr>
+              <w:t xml:space="preserve">host.esxcli -host.ip &lt;ip&gt; &lt;cmd&gt;</w:t>
+            </w:r>
+          </w:p>
+        </w:tc>
+        <w:tc>
+          <w:tcPr>
+            <w:tcW w:type="dxa" w:w="2340"/>
+            <w:shd w:fill="F7F9FC" w:val="clear"/>
+          </w:tcPr>
+          <w:p>
+            <w:r>
+              <w:rPr>
+                <w:sz w:val="18"/>
+                <w:szCs w:val="18"/>
+              </w:rPr>
+              <w:t xml:space="preserve">(Get-EsxCli -VMHost &lt;h&gt; -V2).&lt;ns&gt;.&lt;cmd&gt;.Invoke()</w:t>
+            </w:r>
+          </w:p>
+        </w:tc>
+        <w:tc>
+          <w:tcPr>
+            <w:tcW w:type="dxa" w:w="3060"/>
+            <w:shd w:fill="F7F9FC" w:val="clear"/>
+          </w:tcPr>
+          <w:p>
+            <w:r>
+              <w:rPr>
+                <w:sz w:val="18"/>
+                <w:szCs w:val="18"/>
+              </w:rPr>
+              <w:t xml:space="preserve">ESXi Shell / SSH</w:t>
+            </w:r>
+          </w:p>
+        </w:tc>
+      </w:tr>
+      <w:tr>
+        <w:tc>
+          <w:tcPr>
+            <w:tcW w:type="dxa" w:w="1350"/>
+          </w:tcPr>
+          <w:p>
+            <w:r>
+              <w:rPr>
+                <w:sz w:val="18"/>
+                <w:szCs w:val="18"/>
+              </w:rPr>
+              <w:t xml:space="preserve">VM 內執行指令</w:t>
+            </w:r>
+          </w:p>
+        </w:tc>
+        <w:tc>
+          <w:tcPr>
+            <w:tcW w:type="dxa" w:w="2250"/>
+          </w:tcPr>
+          <w:p>
+            <w:r>
+              <w:rPr>
+                <w:sz w:val="18"/>
+                <w:szCs w:val="18"/>
+              </w:rPr>
+              <w:t xml:space="preserve">guest.run -vm &lt;vm&gt; -- &lt;cmd&gt;</w:t>
+            </w:r>
+          </w:p>
+        </w:tc>
+        <w:tc>
+          <w:tcPr>
+            <w:tcW w:type="dxa" w:w="2340"/>
+          </w:tcPr>
+          <w:p>
+            <w:r>
+              <w:rPr>
+                <w:sz w:val="18"/>
+                <w:szCs w:val="18"/>
+              </w:rPr>
+              <w:t xml:space="preserve">Invoke-VMScript -VM &lt;vm&gt; -ScriptText '&lt;cmd&gt;'</w:t>
+            </w:r>
+          </w:p>
+        </w:tc>
+        <w:tc>
+          <w:tcPr>
+            <w:tcW w:type="dxa" w:w="3060"/>
+          </w:tcPr>
+          <w:p>
+            <w:r>
+              <w:rPr>
+                <w:sz w:val="18"/>
+                <w:szCs w:val="18"/>
+              </w:rPr>
+              <w:t xml:space="preserve">Guest Operations API</w:t>
+            </w:r>
+          </w:p>
+        </w:tc>
+      </w:tr>
+      <w:tr>
+        <w:tc>
+          <w:tcPr>
+            <w:tcW w:type="dxa" w:w="1350"/>
+            <w:shd w:fill="F7F9FC" w:val="clear"/>
+          </w:tcPr>
+          <w:p>
+            <w:r>
+              <w:rPr>
+                <w:sz w:val="18"/>
+                <w:szCs w:val="18"/>
+              </w:rPr>
+              <w:t xml:space="preserve">建 vSphere Namespace</w:t>
+            </w:r>
+          </w:p>
+        </w:tc>
+        <w:tc>
+          <w:tcPr>
+            <w:tcW w:type="dxa" w:w="2250"/>
+            <w:shd w:fill="F7F9FC" w:val="clear"/>
+          </w:tcPr>
+          <w:p>
+            <w:r>
+              <w:rPr>
+                <w:sz w:val="18"/>
+                <w:szCs w:val="18"/>
+              </w:rPr>
+              <w:t xml:space="preserve">無對應</w:t>
+            </w:r>
+          </w:p>
+        </w:tc>
+        <w:tc>
+          <w:tcPr>
+            <w:tcW w:type="dxa" w:w="2340"/>
+            <w:shd w:fill="F7F9FC" w:val="clear"/>
+          </w:tcPr>
+          <w:p>
+            <w:r>
+              <w:rPr>
+                <w:sz w:val="18"/>
+                <w:szCs w:val="18"/>
+              </w:rPr>
+              <w:t xml:space="preserve">無對應</w:t>
+            </w:r>
+          </w:p>
+        </w:tc>
+        <w:tc>
+          <w:tcPr>
+            <w:tcW w:type="dxa" w:w="3060"/>
+            <w:shd w:fill="F7F9FC" w:val="clear"/>
+          </w:tcPr>
+          <w:p>
+            <w:r>
+              <w:rPr>
+                <w:sz w:val="18"/>
+                <w:szCs w:val="18"/>
+              </w:rPr>
+              <w:t xml:space="preserve">UI:Namespaces → CREATE NAMESPACE;REST:POST /api/vcenter/namespaces/instances/v2</w:t>
+            </w:r>
+          </w:p>
+        </w:tc>
+      </w:tr>
+      <w:tr>
+        <w:tc>
+          <w:tcPr>
+            <w:tcW w:type="dxa" w:w="1350"/>
+          </w:tcPr>
+          <w:p>
+            <w:r>
+              <w:rPr>
+                <w:sz w:val="18"/>
+                <w:szCs w:val="18"/>
+              </w:rPr>
+              <w:t xml:space="preserve">vLCM remediate(spherelet)</w:t>
+            </w:r>
+          </w:p>
+        </w:tc>
+        <w:tc>
+          <w:tcPr>
+            <w:tcW w:type="dxa" w:w="2250"/>
+          </w:tcPr>
+          <w:p>
+            <w:r>
+              <w:rPr>
+                <w:sz w:val="18"/>
+                <w:szCs w:val="18"/>
+              </w:rPr>
+              <w:t xml:space="preserve">無對應</w:t>
+            </w:r>
+          </w:p>
+        </w:tc>
+        <w:tc>
+          <w:tcPr>
+            <w:tcW w:type="dxa" w:w="2340"/>
+          </w:tcPr>
+          <w:p>
+            <w:r>
+              <w:rPr>
+                <w:sz w:val="18"/>
+                <w:szCs w:val="18"/>
+              </w:rPr>
+              <w:t xml:space="preserve">vLCM cmdlet(有限)</w:t>
+            </w:r>
+          </w:p>
+        </w:tc>
+        <w:tc>
+          <w:tcPr>
+            <w:tcW w:type="dxa" w:w="3060"/>
+          </w:tcPr>
+          <w:p>
+            <w:r>
+              <w:rPr>
+                <w:sz w:val="18"/>
+                <w:szCs w:val="18"/>
+              </w:rPr>
+              <w:t xml:space="preserve">UI:Cluster → Updates → Image → REMEDIATE ALL;REST:software?action=apply</w:t>
+            </w:r>
+          </w:p>
+        </w:tc>
+      </w:tr>
+      <w:tr>
+        <w:tc>
+          <w:tcPr>
+            <w:tcW w:type="dxa" w:w="1350"/>
+            <w:shd w:fill="F7F9FC" w:val="clear"/>
+          </w:tcPr>
+          <w:p>
+            <w:r>
+              <w:rPr>
+                <w:sz w:val="18"/>
+                <w:szCs w:val="18"/>
+              </w:rPr>
+              <w:t xml:space="preserve">guest cluster / add-on</w:t>
+            </w:r>
+          </w:p>
+        </w:tc>
+        <w:tc>
+          <w:tcPr>
+            <w:tcW w:type="dxa" w:w="2250"/>
+            <w:shd w:fill="F7F9FC" w:val="clear"/>
+          </w:tcPr>
+          <w:p>
+            <w:r>
+              <w:rPr>
+                <w:sz w:val="18"/>
+                <w:szCs w:val="18"/>
+              </w:rPr>
+              <w:t xml:space="preserve">無對應</w:t>
+            </w:r>
+          </w:p>
+        </w:tc>
+        <w:tc>
+          <w:tcPr>
+            <w:tcW w:type="dxa" w:w="2340"/>
+            <w:shd w:fill="F7F9FC" w:val="clear"/>
+          </w:tcPr>
+          <w:p>
+            <w:r>
+              <w:rPr>
+                <w:sz w:val="18"/>
+                <w:szCs w:val="18"/>
+              </w:rPr>
+              <w:t xml:space="preserve">無對應</w:t>
+            </w:r>
+          </w:p>
+        </w:tc>
+        <w:tc>
+          <w:tcPr>
+            <w:tcW w:type="dxa" w:w="3060"/>
+            <w:shd w:fill="F7F9FC" w:val="clear"/>
+          </w:tcPr>
+          <w:p>
+            <w:r>
+              <w:rPr>
+                <w:sz w:val="18"/>
+                <w:szCs w:val="18"/>
+              </w:rPr>
+              <w:t xml:space="preserve">kubectl(Cluster / PackageRepository / PackageInstall)</w:t>
+            </w:r>
+          </w:p>
+        </w:tc>
+      </w:tr>
+    </w:tbl>
+    <w:p>
+      <w:pPr>
+        <w:pStyle w:val="Heading2"/>
+        <w:spacing w:after="120" w:before="260"/>
+      </w:pPr>
+      <w:r>
+        <w:t xml:space="preserve">13.3 REST 實例(本 lab 實測格式)</w:t>
+      </w:r>
+    </w:p>
+    <w:p>
+      <w:pPr>
+        <w:shd w:fill="F4F4F4" w:val="clear"/>
+        <w:spacing w:after="70" w:before="70"/>
+        <w:ind w:left="220"/>
+      </w:pPr>
+      <w:r>
+        <w:rPr>
+          <w:rFonts w:ascii="Consolas" w:cs="Consolas" w:eastAsia="Consolas" w:hAnsi="Consolas"/>
+          <w:sz w:val="16"/>
+          <w:szCs w:val="16"/>
+        </w:rPr>
+        <w:t xml:space="preserve">curl -sk -X POST -H "$H" -H 'Content-Type: application/json' \</w:t>
+      </w:r>
+      <w:r>
+        <w:rPr>
+          <w:rFonts w:ascii="Consolas" w:cs="Consolas" w:eastAsia="Consolas" w:hAnsi="Consolas"/>
+          <w:sz w:val="16"/>
+          <w:szCs w:val="16"/>
+        </w:rPr>
+        <w:br/>
+        <w:t xml:space="preserve">  https://&lt;vc&gt;/api/content/subscribed-library -d '{</w:t>
+      </w:r>
+      <w:r>
+        <w:rPr>
+          <w:rFonts w:ascii="Consolas" w:cs="Consolas" w:eastAsia="Consolas" w:hAnsi="Consolas"/>
+          <w:sz w:val="16"/>
+          <w:szCs w:val="16"/>
+        </w:rPr>
+        <w:br/>
+        <w:t xml:space="preserve">    "name": "vkr-depot",</w:t>
+      </w:r>
+      <w:r>
+        <w:rPr>
+          <w:rFonts w:ascii="Consolas" w:cs="Consolas" w:eastAsia="Consolas" w:hAnsi="Consolas"/>
+          <w:sz w:val="16"/>
+          <w:szCs w:val="16"/>
+        </w:rPr>
+        <w:br/>
+        <w:t xml:space="preserve">    "type": "SUBSCRIBED",</w:t>
+      </w:r>
+      <w:r>
+        <w:rPr>
+          <w:rFonts w:ascii="Consolas" w:cs="Consolas" w:eastAsia="Consolas" w:hAnsi="Consolas"/>
+          <w:sz w:val="16"/>
+          <w:szCs w:val="16"/>
+        </w:rPr>
+        <w:br/>
+        <w:t xml:space="preserve">    "storage_backings": [ { "type": "DATASTORE", "datastore_id": "datastore-15" } ],</w:t>
+      </w:r>
+      <w:r>
+        <w:rPr>
+          <w:rFonts w:ascii="Consolas" w:cs="Consolas" w:eastAsia="Consolas" w:hAnsi="Consolas"/>
+          <w:sz w:val="16"/>
+          <w:szCs w:val="16"/>
+        </w:rPr>
+        <w:br/>
+        <w:t xml:space="preserve">    "subscription_info": {</w:t>
+      </w:r>
+      <w:r>
+        <w:rPr>
+          <w:rFonts w:ascii="Consolas" w:cs="Consolas" w:eastAsia="Consolas" w:hAnsi="Consolas"/>
+          <w:sz w:val="16"/>
+          <w:szCs w:val="16"/>
+        </w:rPr>
+        <w:br/>
+        <w:t xml:space="preserve">      "subscription_url": "http://&lt;depot&gt;:8888/PROD/COMP/VKR/lib.json",</w:t>
+      </w:r>
+      <w:r>
+        <w:rPr>
+          <w:rFonts w:ascii="Consolas" w:cs="Consolas" w:eastAsia="Consolas" w:hAnsi="Consolas"/>
+          <w:sz w:val="16"/>
+          <w:szCs w:val="16"/>
+        </w:rPr>
+        <w:br/>
+        <w:t xml:space="preserve">      "authentication_method": "NONE",</w:t>
+      </w:r>
+      <w:r>
+        <w:rPr>
+          <w:rFonts w:ascii="Consolas" w:cs="Consolas" w:eastAsia="Consolas" w:hAnsi="Consolas"/>
+          <w:sz w:val="16"/>
+          <w:szCs w:val="16"/>
+        </w:rPr>
+        <w:br/>
+        <w:t xml:space="preserve">      "automatic_sync_enabled": true,</w:t>
+      </w:r>
+      <w:r>
+        <w:rPr>
+          <w:rFonts w:ascii="Consolas" w:cs="Consolas" w:eastAsia="Consolas" w:hAnsi="Consolas"/>
+          <w:sz w:val="16"/>
+          <w:szCs w:val="16"/>
+        </w:rPr>
+        <w:br/>
+        <w:t xml:space="preserve">      "on_demand": false } }'</w:t>
+      </w:r>
+      <w:r>
+        <w:rPr>
+          <w:rFonts w:ascii="Consolas" w:cs="Consolas" w:eastAsia="Consolas" w:hAnsi="Consolas"/>
+          <w:sz w:val="16"/>
+          <w:szCs w:val="16"/>
+        </w:rPr>
+        <w:br/>
+        <w:t xml:space="preserve"/>
+      </w:r>
+      <w:r>
+        <w:rPr>
+          <w:rFonts w:ascii="Consolas" w:cs="Consolas" w:eastAsia="Consolas" w:hAnsi="Consolas"/>
+          <w:sz w:val="16"/>
+          <w:szCs w:val="16"/>
+        </w:rPr>
+        <w:br/>
+        <w:t xml:space="preserve"># 查 moref</w:t>
+      </w:r>
+      <w:r>
+        <w:rPr>
+          <w:rFonts w:ascii="Consolas" w:cs="Consolas" w:eastAsia="Consolas" w:hAnsi="Consolas"/>
+          <w:sz w:val="16"/>
+          <w:szCs w:val="16"/>
+        </w:rPr>
+        <w:br/>
+        <w:t xml:space="preserve">curl -sk -H "$H" https://&lt;vc&gt;/api/vcenter/datastore | jq -r '.[]|"\(.datastore)  \(.name)"'</w:t>
+      </w:r>
+      <w:r>
+        <w:rPr>
+          <w:rFonts w:ascii="Consolas" w:cs="Consolas" w:eastAsia="Consolas" w:hAnsi="Consolas"/>
+          <w:sz w:val="16"/>
+          <w:szCs w:val="16"/>
+        </w:rPr>
+        <w:br/>
+        <w:t xml:space="preserve">#   datastore-15  m01-cl01-ds-vsan01</w:t>
+      </w:r>
+      <w:r>
+        <w:rPr>
+          <w:rFonts w:ascii="Consolas" w:cs="Consolas" w:eastAsia="Consolas" w:hAnsi="Consolas"/>
+          <w:sz w:val="16"/>
+          <w:szCs w:val="16"/>
+        </w:rPr>
+        <w:br/>
+        <w:t xml:space="preserve">curl -sk -H "$H" https://&lt;vc&gt;/api/vcenter/cluster   | jq -r '.[]|"\(.cluster)  \(.name)"'</w:t>
+      </w:r>
+      <w:r>
+        <w:rPr>
+          <w:rFonts w:ascii="Consolas" w:cs="Consolas" w:eastAsia="Consolas" w:hAnsi="Consolas"/>
+          <w:sz w:val="16"/>
+          <w:szCs w:val="16"/>
+        </w:rPr>
+        <w:br/>
+        <w:t xml:space="preserve">#   domain-c9  m01-cl01</w:t>
+      </w:r>
+    </w:p>
+    <w:p>
+      <w:pPr>
+        <w:pBdr>
+          <w:left w:val="single" w:color="2E7D32" w:sz="18"/>
+        </w:pBdr>
+        <w:shd w:fill="E8F5E9" w:val="clear"/>
+        <w:spacing w:after="90" w:before="90"/>
+        <w:ind w:left="120" w:right="120"/>
+      </w:pPr>
+      <w:r>
+        <w:rPr>
+          <w:color w:val="2E7D32"/>
+          <w:sz w:val="20"/>
+          <w:szCs w:val="20"/>
+        </w:rPr>
+        <w:t xml:space="preserve">現場沒有 govc 的建議組合:Content Library 建立與 OVF 匯入用 PowerCLI(一行完成,REST 要四步);Supervisor / Namespace / 映像庫指派這些本來就沒有 govc 對應的動作用 UI 或 REST;guest cluster 與 add-on 一律 kubectl。</w:t>
+      </w:r>
+    </w:p>
     <w:p>
       <w:r>
         <w:br w:type="page"/>

</xml_diff>